<commit_message>
Use the real Cassini Mimas photograph for the easter-egg scene
Replaces the procedurally rendered Mimas with an actual NASA/JPL-Caltech
Cassini image showing the Herschel crater. All three planetary scenes are
now genuine public-domain spacecraft imagery; only the survey star field
is still generated.

The scene still lives in the ROM detector image store outside the golden
application image, so the player's binary remains pixel-free (verified:
the Mimas bytes do not appear in probe_app.bin). 62 checks still passing.
</commit_message>
<xml_diff>
--- a/docs/Firmware_Spec.docx
+++ b/docs/Firmware_Spec.docx
@@ -8225,8 +8225,8 @@
       </w:tblPr>
       <w:tblGrid>
         <w:gridCol w:w="1050"/>
-        <w:gridCol w:w="4044"/>
-        <w:gridCol w:w="4266"/>
+        <w:gridCol w:w="4295"/>
+        <w:gridCol w:w="4015"/>
       </w:tblGrid>
       <w:tr>
         <w:trPr>
@@ -8260,7 +8260,7 @@
         </w:tc>
         <w:tc>
           <w:tcPr>
-            <w:tcW w:type="dxa" w:w="4044"/>
+            <w:tcW w:type="dxa" w:w="4295"/>
             <w:shd w:fill="D9E2F3" w:val="clear"/>
             <w:tcMar>
               <w:top w:type="dxa" w:w="55"/>
@@ -8286,7 +8286,7 @@
         </w:tc>
         <w:tc>
           <w:tcPr>
-            <w:tcW w:type="dxa" w:w="4266"/>
+            <w:tcW w:type="dxa" w:w="4015"/>
             <w:shd w:fill="D9E2F3" w:val="clear"/>
             <w:tcMar>
               <w:top w:type="dxa" w:w="55"/>
@@ -8339,7 +8339,7 @@
         </w:tc>
         <w:tc>
           <w:tcPr>
-            <w:tcW w:type="dxa" w:w="4044"/>
+            <w:tcW w:type="dxa" w:w="4295"/>
             <w:tcMar>
               <w:top w:type="dxa" w:w="55"/>
               <w:left w:type="dxa" w:w="90"/>
@@ -8364,7 +8364,7 @@
         </w:tc>
         <w:tc>
           <w:tcPr>
-            <w:tcW w:type="dxa" w:w="4266"/>
+            <w:tcW w:type="dxa" w:w="4015"/>
             <w:tcMar>
               <w:top w:type="dxa" w:w="55"/>
               <w:left w:type="dxa" w:w="90"/>
@@ -8416,7 +8416,7 @@
         </w:tc>
         <w:tc>
           <w:tcPr>
-            <w:tcW w:type="dxa" w:w="4044"/>
+            <w:tcW w:type="dxa" w:w="4295"/>
             <w:tcMar>
               <w:top w:type="dxa" w:w="55"/>
               <w:left w:type="dxa" w:w="90"/>
@@ -8441,7 +8441,7 @@
         </w:tc>
         <w:tc>
           <w:tcPr>
-            <w:tcW w:type="dxa" w:w="4266"/>
+            <w:tcW w:type="dxa" w:w="4015"/>
             <w:tcMar>
               <w:top w:type="dxa" w:w="55"/>
               <w:left w:type="dxa" w:w="90"/>
@@ -8493,7 +8493,7 @@
         </w:tc>
         <w:tc>
           <w:tcPr>
-            <w:tcW w:type="dxa" w:w="4044"/>
+            <w:tcW w:type="dxa" w:w="4295"/>
             <w:tcMar>
               <w:top w:type="dxa" w:w="55"/>
               <w:left w:type="dxa" w:w="90"/>
@@ -8518,7 +8518,7 @@
         </w:tc>
         <w:tc>
           <w:tcPr>
-            <w:tcW w:type="dxa" w:w="4266"/>
+            <w:tcW w:type="dxa" w:w="4015"/>
             <w:tcMar>
               <w:top w:type="dxa" w:w="55"/>
               <w:left w:type="dxa" w:w="90"/>
@@ -8570,26 +8570,26 @@
         </w:tc>
         <w:tc>
           <w:tcPr>
-            <w:tcW w:type="dxa" w:w="4044"/>
-            <w:tcMar>
-              <w:top w:type="dxa" w:w="55"/>
-              <w:left w:type="dxa" w:w="90"/>
-              <w:bottom w:type="dxa" w:w="55"/>
-              <w:right w:type="dxa" w:w="90"/>
-            </w:tcMar>
-          </w:tcPr>
-          <w:p>
-            <w:pPr>
-              <w:spacing w:after="0" w:line="240"/>
-            </w:pPr>
-            <w:r>
-              <w:rPr>
-                <w:b w:val="false"/>
-                <w:bCs w:val="false"/>
-                <w:i w:val="false"/>
-                <w:iCs w:val="false"/>
-              </w:rPr>
-              <w:t xml:space="preserve">Mimas — </w:t>
+            <w:tcW w:type="dxa" w:w="4295"/>
+            <w:tcMar>
+              <w:top w:type="dxa" w:w="55"/>
+              <w:left w:type="dxa" w:w="90"/>
+              <w:bottom w:type="dxa" w:w="55"/>
+              <w:right w:type="dxa" w:w="90"/>
+            </w:tcMar>
+          </w:tcPr>
+          <w:p>
+            <w:pPr>
+              <w:spacing w:after="0" w:line="240"/>
+            </w:pPr>
+            <w:r>
+              <w:rPr>
+                <w:b w:val="false"/>
+                <w:bCs w:val="false"/>
+                <w:i w:val="false"/>
+                <w:iCs w:val="false"/>
+              </w:rPr>
+              <w:t xml:space="preserve">Mimas, Herschel crater — </w:t>
             </w:r>
             <w:r>
               <w:rPr>
@@ -8604,26 +8604,26 @@
         </w:tc>
         <w:tc>
           <w:tcPr>
-            <w:tcW w:type="dxa" w:w="4266"/>
-            <w:tcMar>
-              <w:top w:type="dxa" w:w="55"/>
-              <w:left w:type="dxa" w:w="90"/>
-              <w:bottom w:type="dxa" w:w="55"/>
-              <w:right w:type="dxa" w:w="90"/>
-            </w:tcMar>
-          </w:tcPr>
-          <w:p>
-            <w:pPr>
-              <w:spacing w:after="0" w:line="240"/>
-            </w:pPr>
-            <w:r>
-              <w:rPr>
-                <w:b w:val="false"/>
-                <w:bCs w:val="false"/>
-                <w:i w:val="false"/>
-                <w:iCs w:val="false"/>
-              </w:rPr>
-              <w:t xml:space="preserve">procedural</w:t>
+            <w:tcW w:type="dxa" w:w="4015"/>
+            <w:tcMar>
+              <w:top w:type="dxa" w:w="55"/>
+              <w:left w:type="dxa" w:w="90"/>
+              <w:bottom w:type="dxa" w:w="55"/>
+              <w:right w:type="dxa" w:w="90"/>
+            </w:tcMar>
+          </w:tcPr>
+          <w:p>
+            <w:pPr>
+              <w:spacing w:after="0" w:line="240"/>
+            </w:pPr>
+            <w:r>
+              <w:rPr>
+                <w:b w:val="false"/>
+                <w:bCs w:val="false"/>
+                <w:i w:val="false"/>
+                <w:iCs w:val="false"/>
+              </w:rPr>
+              <w:t xml:space="preserve">NASA/JPL-Caltech (Cassini), public domain</w:t>
             </w:r>
           </w:p>
         </w:tc>
@@ -8690,7 +8690,7 @@
           <w:i w:val="false"/>
           <w:iCs w:val="false"/>
         </w:rPr>
-        <w:t xml:space="preserve"> returns it instead of the commanded target: Mimas, the Saturnian moon whose 130 km Herschel crater gives it a famously Death-Star-like silhouette. The roll is advanced per capture from a fixed seed rather than from the clock, so it is </w:t>
+        <w:t xml:space="preserve"> returns it instead of the commanded target: a Cassini image of Mimas, the Saturnian moon whose 130 km Herschel crater gives it a famously Death-Star-like silhouette. The roll is advanced per capture from a fixed seed rather than from the clock, so it is </w:t>
       </w:r>
       <w:r>
         <w:rPr>

</xml_diff>

<commit_message>
Remove stale open questions left behind in spec section 15
Section 15 carried three orphaned items (uplink budget vs. imaging,
detector store readability, scene resolution) from an earlier numbered
list, sitting directly beneath the resolved entries that had already
closed all three -- and asserting the opposite. The scene-resolution
item still said 64x64. The document footer still claimed v0.7 and an
81-check suite.

Replaces them with a Known Gaps table that says what is genuinely not
built -- the game daemon, scenario packages, the Renode harness tier,
the web front end -- and distinguishes that from open design questions,
of which there are none. Notes the one soft asset: the Mimas easter-egg
scene is a 64x64 Cassini source upscaled to 96x96, unlike the other
four, which are native.
</commit_message>
<xml_diff>
--- a/docs/Firmware_Spec.docx
+++ b/docs/Firmware_Spec.docx
@@ -22822,17 +22822,12 @@
           <w:i w:val="false"/>
           <w:iCs w:val="false"/>
         </w:rPr>
-        <w:t xml:space="preserve"> All questions raised at first issue are resolved; further changes should come from playtest evidence.</w:t>
+        <w:t xml:space="preserve"> Every question raised at first issue is resolved. Further changes to the values above should come from playtest evidence rather than desk reasoning.</w:t>
       </w:r>
     </w:p>
     <w:p>
       <w:pPr>
-        <w:pStyle w:val="ListParagraph"/>
-        <w:numPr>
-          <w:ilvl w:val="0"/>
-          <w:numId w:val="3"/>
-        </w:numPr>
-        <w:spacing w:after="70" w:line="260"/>
+        <w:spacing w:after="130" w:line="270"/>
       </w:pPr>
       <w:r>
         <w:rPr>
@@ -22841,139 +22836,493 @@
           <w:i w:val="false"/>
           <w:iCs w:val="false"/>
         </w:rPr>
-        <w:t xml:space="preserve">Uplink budget vs. imaging</w:t>
-      </w:r>
-      <w:r>
-        <w:rPr>
-          <w:b w:val="false"/>
-          <w:bCs w:val="false"/>
-          <w:i w:val="false"/>
-          <w:iCs w:val="false"/>
-        </w:rPr>
-        <w:t xml:space="preserve"> (charter R4.2). A budget tight enough to make patching feel precious can make a 64-command image downlink impossible. These must be tuned together, or imaging needs its own allowance — the </w:t>
-      </w:r>
-      <w:r>
-        <w:rPr>
-          <w:rFonts w:ascii="Consolas" w:cs="Consolas" w:eastAsia="Consolas" w:hAnsi="Consolas"/>
-          <w:b w:val="false"/>
-          <w:bCs w:val="false"/>
-          <w:i w:val="false"/>
-          <w:iCs w:val="false"/>
-          <w:sz w:val="19"/>
-          <w:szCs w:val="19"/>
-          <w:shd w:fill="F2F2F2" w:val="clear"/>
-        </w:rPr>
-        <w:t xml:space="preserve">DUMP</w:t>
-      </w:r>
-      <w:r>
-        <w:rPr>
-          <w:b w:val="false"/>
-          <w:bCs w:val="false"/>
-          <w:i w:val="false"/>
-          <w:iCs w:val="false"/>
-        </w:rPr>
-        <w:t xml:space="preserve"> gate is one lever.</w:t>
+        <w:t xml:space="preserve">Known gaps — not open questions, but work not yet done.</w:t>
+      </w:r>
+      <w:r>
+        <w:rPr>
+          <w:b w:val="false"/>
+          <w:bCs w:val="false"/>
+          <w:i w:val="false"/>
+          <w:iCs w:val="false"/>
+        </w:rPr>
+        <w:t xml:space="preserve"> These are scoped deliberately: the reference firmware is complete, and what remains below is the capstone team's build.</w:t>
       </w:r>
     </w:p>
+    <w:tbl>
+      <w:tblPr>
+        <w:tblW w:type="dxa" w:w="9360"/>
+        <w:tblBorders>
+          <w:top w:val="single" w:color="auto" w:sz="4"/>
+          <w:left w:val="single" w:color="auto" w:sz="4"/>
+          <w:bottom w:val="single" w:color="auto" w:sz="4"/>
+          <w:right w:val="single" w:color="auto" w:sz="4"/>
+          <w:insideH w:val="single" w:color="auto" w:sz="4"/>
+          <w:insideV w:val="single" w:color="auto" w:sz="4"/>
+        </w:tblBorders>
+      </w:tblPr>
+      <w:tblGrid>
+        <w:gridCol w:w="3409"/>
+        <w:gridCol w:w="5951"/>
+      </w:tblGrid>
+      <w:tr>
+        <w:trPr>
+          <w:tblHeader/>
+        </w:trPr>
+        <w:tc>
+          <w:tcPr>
+            <w:tcW w:type="dxa" w:w="3409"/>
+            <w:shd w:fill="D9E2F3" w:val="clear"/>
+            <w:tcMar>
+              <w:top w:type="dxa" w:w="55"/>
+              <w:left w:type="dxa" w:w="90"/>
+              <w:bottom w:type="dxa" w:w="55"/>
+              <w:right w:type="dxa" w:w="90"/>
+            </w:tcMar>
+          </w:tcPr>
+          <w:p>
+            <w:pPr>
+              <w:spacing w:after="0" w:line="240"/>
+            </w:pPr>
+            <w:r>
+              <w:rPr>
+                <w:b/>
+                <w:bCs/>
+                <w:sz w:val="19"/>
+                <w:szCs w:val="19"/>
+              </w:rPr>
+              <w:t xml:space="preserve">Gap</w:t>
+            </w:r>
+          </w:p>
+        </w:tc>
+        <w:tc>
+          <w:tcPr>
+            <w:tcW w:type="dxa" w:w="5951"/>
+            <w:shd w:fill="D9E2F3" w:val="clear"/>
+            <w:tcMar>
+              <w:top w:type="dxa" w:w="55"/>
+              <w:left w:type="dxa" w:w="90"/>
+              <w:bottom w:type="dxa" w:w="55"/>
+              <w:right w:type="dxa" w:w="90"/>
+            </w:tcMar>
+          </w:tcPr>
+          <w:p>
+            <w:pPr>
+              <w:spacing w:after="0" w:line="240"/>
+            </w:pPr>
+            <w:r>
+              <w:rPr>
+                <w:b/>
+                <w:bCs/>
+                <w:sz w:val="19"/>
+                <w:szCs w:val="19"/>
+              </w:rPr>
+              <w:t xml:space="preserve">Status</w:t>
+            </w:r>
+          </w:p>
+        </w:tc>
+      </w:tr>
+      <w:tr>
+        <w:tc>
+          <w:tcPr>
+            <w:tcW w:type="dxa" w:w="3409"/>
+            <w:tcMar>
+              <w:top w:type="dxa" w:w="55"/>
+              <w:left w:type="dxa" w:w="90"/>
+              <w:bottom w:type="dxa" w:w="55"/>
+              <w:right w:type="dxa" w:w="90"/>
+            </w:tcMar>
+          </w:tcPr>
+          <w:p>
+            <w:pPr>
+              <w:spacing w:after="0" w:line="240"/>
+            </w:pPr>
+            <w:r>
+              <w:rPr>
+                <w:b/>
+                <w:bCs/>
+                <w:i w:val="false"/>
+                <w:iCs w:val="false"/>
+              </w:rPr>
+              <w:t xml:space="preserve">Game daemon</w:t>
+            </w:r>
+            <w:r>
+              <w:rPr>
+                <w:b w:val="false"/>
+                <w:bCs w:val="false"/>
+                <w:i w:val="false"/>
+                <w:iCs w:val="false"/>
+              </w:rPr>
+              <w:t xml:space="preserve"> (§13, charter) — scenario loading, objective evaluation, command log, saves by replay</w:t>
+            </w:r>
+          </w:p>
+        </w:tc>
+        <w:tc>
+          <w:tcPr>
+            <w:tcW w:type="dxa" w:w="5951"/>
+            <w:tcMar>
+              <w:top w:type="dxa" w:w="55"/>
+              <w:left w:type="dxa" w:w="90"/>
+              <w:bottom w:type="dxa" w:w="55"/>
+              <w:right w:type="dxa" w:w="90"/>
+            </w:tcMar>
+          </w:tcPr>
+          <w:p>
+            <w:pPr>
+              <w:spacing w:after="0" w:line="240"/>
+            </w:pPr>
+            <w:r>
+              <w:rPr>
+                <w:b w:val="false"/>
+                <w:bCs w:val="false"/>
+                <w:i w:val="false"/>
+                <w:iCs w:val="false"/>
+              </w:rPr>
+              <w:t xml:space="preserve">Specified, not built. This is the students' primary deliverable.</w:t>
+            </w:r>
+          </w:p>
+        </w:tc>
+      </w:tr>
+      <w:tr>
+        <w:tc>
+          <w:tcPr>
+            <w:tcW w:type="dxa" w:w="3409"/>
+            <w:tcMar>
+              <w:top w:type="dxa" w:w="55"/>
+              <w:left w:type="dxa" w:w="90"/>
+              <w:bottom w:type="dxa" w:w="55"/>
+              <w:right w:type="dxa" w:w="90"/>
+            </w:tcMar>
+          </w:tcPr>
+          <w:p>
+            <w:pPr>
+              <w:spacing w:after="0" w:line="240"/>
+            </w:pPr>
+            <w:r>
+              <w:rPr>
+                <w:b/>
+                <w:bCs/>
+                <w:i w:val="false"/>
+                <w:iCs w:val="false"/>
+              </w:rPr>
+              <w:t xml:space="preserve">Scenario packages</w:t>
+            </w:r>
+            <w:r>
+              <w:rPr>
+                <w:b w:val="false"/>
+                <w:bCs w:val="false"/>
+                <w:i w:val="false"/>
+                <w:iCs w:val="false"/>
+              </w:rPr>
+              <w:t xml:space="preserve"> — </w:t>
+            </w:r>
+            <w:r>
+              <w:rPr>
+                <w:rFonts w:ascii="Consolas" w:cs="Consolas" w:eastAsia="Consolas" w:hAnsi="Consolas"/>
+                <w:b w:val="false"/>
+                <w:bCs w:val="false"/>
+                <w:i w:val="false"/>
+                <w:iCs w:val="false"/>
+                <w:sz w:val="19"/>
+                <w:szCs w:val="19"/>
+                <w:shd w:fill="F2F2F2" w:val="clear"/>
+              </w:rPr>
+              <w:t xml:space="preserve">manifest</w:t>
+            </w:r>
+            <w:r>
+              <w:rPr>
+                <w:b w:val="false"/>
+                <w:bCs w:val="false"/>
+                <w:i w:val="false"/>
+                <w:iCs w:val="false"/>
+              </w:rPr>
+              <w:t xml:space="preserve"> / </w:t>
+            </w:r>
+            <w:r>
+              <w:rPr>
+                <w:rFonts w:ascii="Consolas" w:cs="Consolas" w:eastAsia="Consolas" w:hAnsi="Consolas"/>
+                <w:b w:val="false"/>
+                <w:bCs w:val="false"/>
+                <w:i w:val="false"/>
+                <w:iCs w:val="false"/>
+                <w:sz w:val="19"/>
+                <w:szCs w:val="19"/>
+                <w:shd w:fill="F2F2F2" w:val="clear"/>
+              </w:rPr>
+              <w:t xml:space="preserve">symbols.json</w:t>
+            </w:r>
+            <w:r>
+              <w:rPr>
+                <w:b w:val="false"/>
+                <w:bCs w:val="false"/>
+                <w:i w:val="false"/>
+                <w:iCs w:val="false"/>
+              </w:rPr>
+              <w:t xml:space="preserve"> / </w:t>
+            </w:r>
+            <w:r>
+              <w:rPr>
+                <w:rFonts w:ascii="Consolas" w:cs="Consolas" w:eastAsia="Consolas" w:hAnsi="Consolas"/>
+                <w:b w:val="false"/>
+                <w:bCs w:val="false"/>
+                <w:i w:val="false"/>
+                <w:iCs w:val="false"/>
+                <w:sz w:val="19"/>
+                <w:szCs w:val="19"/>
+                <w:shd w:fill="F2F2F2" w:val="clear"/>
+              </w:rPr>
+              <w:t xml:space="preserve">memmap.json</w:t>
+            </w:r>
+            <w:r>
+              <w:rPr>
+                <w:b w:val="false"/>
+                <w:bCs w:val="false"/>
+                <w:i w:val="false"/>
+                <w:iCs w:val="false"/>
+              </w:rPr>
+              <w:t xml:space="preserve"> / objective assertions as pure content</w:t>
+            </w:r>
+          </w:p>
+        </w:tc>
+        <w:tc>
+          <w:tcPr>
+            <w:tcW w:type="dxa" w:w="5951"/>
+            <w:tcMar>
+              <w:top w:type="dxa" w:w="55"/>
+              <w:left w:type="dxa" w:w="90"/>
+              <w:bottom w:type="dxa" w:w="55"/>
+              <w:right w:type="dxa" w:w="90"/>
+            </w:tcMar>
+          </w:tcPr>
+          <w:p>
+            <w:pPr>
+              <w:spacing w:after="0" w:line="240"/>
+            </w:pPr>
+            <w:r>
+              <w:rPr>
+                <w:b w:val="false"/>
+                <w:bCs w:val="false"/>
+                <w:i w:val="false"/>
+                <w:iCs w:val="false"/>
+              </w:rPr>
+              <w:t xml:space="preserve">The firmware side of the seam exists (</w:t>
+            </w:r>
+            <w:r>
+              <w:rPr>
+                <w:rFonts w:ascii="Consolas" w:cs="Consolas" w:eastAsia="Consolas" w:hAnsi="Consolas"/>
+                <w:b w:val="false"/>
+                <w:bCs w:val="false"/>
+                <w:i w:val="false"/>
+                <w:iCs w:val="false"/>
+                <w:sz w:val="19"/>
+                <w:szCs w:val="19"/>
+                <w:shd w:fill="F2F2F2" w:val="clear"/>
+              </w:rPr>
+              <w:t xml:space="preserve">make</w:t>
+            </w:r>
+            <w:r>
+              <w:rPr>
+                <w:b w:val="false"/>
+                <w:bCs w:val="false"/>
+                <w:i w:val="false"/>
+                <w:iCs w:val="false"/>
+              </w:rPr>
+              <w:t xml:space="preserve"> emits both JSON files); no package format instance yet.</w:t>
+            </w:r>
+          </w:p>
+        </w:tc>
+      </w:tr>
+      <w:tr>
+        <w:tc>
+          <w:tcPr>
+            <w:tcW w:type="dxa" w:w="3409"/>
+            <w:tcMar>
+              <w:top w:type="dxa" w:w="55"/>
+              <w:left w:type="dxa" w:w="90"/>
+              <w:bottom w:type="dxa" w:w="55"/>
+              <w:right w:type="dxa" w:w="90"/>
+            </w:tcMar>
+          </w:tcPr>
+          <w:p>
+            <w:pPr>
+              <w:spacing w:after="0" w:line="240"/>
+            </w:pPr>
+            <w:r>
+              <w:rPr>
+                <w:b/>
+                <w:bCs/>
+                <w:i w:val="false"/>
+                <w:iCs w:val="false"/>
+              </w:rPr>
+              <w:t xml:space="preserve">Harness tier</w:t>
+            </w:r>
+            <w:r>
+              <w:rPr>
+                <w:b w:val="false"/>
+                <w:bCs w:val="false"/>
+                <w:i w:val="false"/>
+                <w:iCs w:val="false"/>
+              </w:rPr>
+              <w:t xml:space="preserve"> (§6, Renode) — sensors as true MMIO at the same addresses rather than SIM-tier RAM</w:t>
+            </w:r>
+          </w:p>
+        </w:tc>
+        <w:tc>
+          <w:tcPr>
+            <w:tcW w:type="dxa" w:w="5951"/>
+            <w:tcMar>
+              <w:top w:type="dxa" w:w="55"/>
+              <w:left w:type="dxa" w:w="90"/>
+              <w:bottom w:type="dxa" w:w="55"/>
+              <w:right w:type="dxa" w:w="90"/>
+            </w:tcMar>
+          </w:tcPr>
+          <w:p>
+            <w:pPr>
+              <w:spacing w:after="0" w:line="240"/>
+            </w:pPr>
+            <w:r>
+              <w:rPr>
+                <w:b w:val="false"/>
+                <w:bCs w:val="false"/>
+                <w:i w:val="false"/>
+                <w:iCs w:val="false"/>
+              </w:rPr>
+              <w:t xml:space="preserve">Specified with identical observable behavior; only the QEMU SIM tier is built.</w:t>
+            </w:r>
+          </w:p>
+        </w:tc>
+      </w:tr>
+      <w:tr>
+        <w:tc>
+          <w:tcPr>
+            <w:tcW w:type="dxa" w:w="3409"/>
+            <w:tcMar>
+              <w:top w:type="dxa" w:w="55"/>
+              <w:left w:type="dxa" w:w="90"/>
+              <w:bottom w:type="dxa" w:w="55"/>
+              <w:right w:type="dxa" w:w="90"/>
+            </w:tcMar>
+          </w:tcPr>
+          <w:p>
+            <w:pPr>
+              <w:spacing w:after="0" w:line="240"/>
+            </w:pPr>
+            <w:r>
+              <w:rPr>
+                <w:b/>
+                <w:bCs/>
+                <w:i w:val="false"/>
+                <w:iCs w:val="false"/>
+              </w:rPr>
+              <w:t xml:space="preserve">Web front end</w:t>
+            </w:r>
+            <w:r>
+              <w:rPr>
+                <w:b w:val="false"/>
+                <w:bCs w:val="false"/>
+                <w:i w:val="false"/>
+                <w:iCs w:val="false"/>
+              </w:rPr>
+              <w:t xml:space="preserve"> (charter) — console, telemetry view, objective status</w:t>
+            </w:r>
+          </w:p>
+        </w:tc>
+        <w:tc>
+          <w:tcPr>
+            <w:tcW w:type="dxa" w:w="5951"/>
+            <w:tcMar>
+              <w:top w:type="dxa" w:w="55"/>
+              <w:left w:type="dxa" w:w="90"/>
+              <w:bottom w:type="dxa" w:w="55"/>
+              <w:right w:type="dxa" w:w="90"/>
+            </w:tcMar>
+          </w:tcPr>
+          <w:p>
+            <w:pPr>
+              <w:spacing w:after="0" w:line="240"/>
+            </w:pPr>
+            <w:r>
+              <w:rPr>
+                <w:b w:val="false"/>
+                <w:bCs w:val="false"/>
+                <w:i w:val="false"/>
+                <w:iCs w:val="false"/>
+              </w:rPr>
+              <w:t xml:space="preserve">Not started.</w:t>
+            </w:r>
+          </w:p>
+        </w:tc>
+      </w:tr>
+      <w:tr>
+        <w:tc>
+          <w:tcPr>
+            <w:tcW w:type="dxa" w:w="3409"/>
+            <w:tcMar>
+              <w:top w:type="dxa" w:w="55"/>
+              <w:left w:type="dxa" w:w="90"/>
+              <w:bottom w:type="dxa" w:w="55"/>
+              <w:right w:type="dxa" w:w="90"/>
+            </w:tcMar>
+          </w:tcPr>
+          <w:p>
+            <w:pPr>
+              <w:spacing w:after="0" w:line="240"/>
+            </w:pPr>
+            <w:r>
+              <w:rPr>
+                <w:b/>
+                <w:bCs/>
+                <w:i w:val="false"/>
+                <w:iCs w:val="false"/>
+              </w:rPr>
+              <w:t xml:space="preserve">Easter-egg source resolution</w:t>
+            </w:r>
+          </w:p>
+        </w:tc>
+        <w:tc>
+          <w:tcPr>
+            <w:tcW w:type="dxa" w:w="5951"/>
+            <w:tcMar>
+              <w:top w:type="dxa" w:w="55"/>
+              <w:left w:type="dxa" w:w="90"/>
+              <w:bottom w:type="dxa" w:w="55"/>
+              <w:right w:type="dxa" w:w="90"/>
+            </w:tcMar>
+          </w:tcPr>
+          <w:p>
+            <w:pPr>
+              <w:spacing w:after="0" w:line="240"/>
+            </w:pPr>
+            <w:r>
+              <w:rPr>
+                <w:rFonts w:ascii="Consolas" w:cs="Consolas" w:eastAsia="Consolas" w:hAnsi="Consolas"/>
+                <w:b w:val="false"/>
+                <w:bCs w:val="false"/>
+                <w:i w:val="false"/>
+                <w:iCs w:val="false"/>
+                <w:sz w:val="19"/>
+                <w:szCs w:val="19"/>
+                <w:shd w:fill="F2F2F2" w:val="clear"/>
+              </w:rPr>
+              <w:t xml:space="preserve">assets/mimas.png</w:t>
+            </w:r>
+            <w:r>
+              <w:rPr>
+                <w:b w:val="false"/>
+                <w:bCs w:val="false"/>
+                <w:i w:val="false"/>
+                <w:iCs w:val="false"/>
+              </w:rPr>
+              <w:t xml:space="preserve"> is 64×64 (Cassini) bilinearly upscaled to 96×96; the other four scenes are native 96×96. A 96×96-or-larger Mimas source would remove the only soft image in the store.</w:t>
+            </w:r>
+          </w:p>
+        </w:tc>
+      </w:tr>
+    </w:tbl>
     <w:p>
       <w:pPr>
-        <w:pStyle w:val="ListParagraph"/>
-        <w:numPr>
-          <w:ilvl w:val="0"/>
-          <w:numId w:val="3"/>
-        </w:numPr>
-        <w:spacing w:after="70" w:line="260"/>
+        <w:spacing w:after="120"/>
       </w:pPr>
-      <w:r>
-        <w:rPr>
-          <w:b/>
-          <w:bCs/>
-          <w:i w:val="false"/>
-          <w:iCs w:val="false"/>
-        </w:rPr>
-        <w:t xml:space="preserve">Is the detector store `PEEK`-readable?</w:t>
-      </w:r>
-      <w:r>
-        <w:rPr>
-          <w:b w:val="false"/>
-          <w:bCs w:val="false"/>
-          <w:i w:val="false"/>
-          <w:iCs w:val="false"/>
-        </w:rPr>
-        <w:t xml:space="preserve"> Currently yes: a player who finds </w:t>
-      </w:r>
-      <w:r>
-        <w:rPr>
-          <w:rFonts w:ascii="Consolas" w:cs="Consolas" w:eastAsia="Consolas" w:hAnsi="Consolas"/>
-          <w:b w:val="false"/>
-          <w:bCs w:val="false"/>
-          <w:i w:val="false"/>
-          <w:iCs w:val="false"/>
-          <w:sz w:val="19"/>
-          <w:szCs w:val="19"/>
-          <w:shd w:fill="F2F2F2" w:val="clear"/>
-        </w:rPr>
-        <w:t xml:space="preserve">0x0002_4000</w:t>
-      </w:r>
-      <w:r>
-        <w:rPr>
-          <w:b w:val="false"/>
-          <w:bCs w:val="false"/>
-          <w:i w:val="false"/>
-          <w:iCs w:val="false"/>
-        </w:rPr>
-        <w:t xml:space="preserve"> can dump the source imagery at 64 bytes per command. Recommended to keep — it is expensive, and discovering an easter egg by reverse engineering is the point — but a scenario wanting the imagery strictly unreachable can exclude the range from </w:t>
-      </w:r>
-      <w:r>
-        <w:rPr>
-          <w:rFonts w:ascii="Consolas" w:cs="Consolas" w:eastAsia="Consolas" w:hAnsi="Consolas"/>
-          <w:b w:val="false"/>
-          <w:bCs w:val="false"/>
-          <w:i w:val="false"/>
-          <w:iCs w:val="false"/>
-          <w:sz w:val="19"/>
-          <w:szCs w:val="19"/>
-          <w:shd w:fill="F2F2F2" w:val="clear"/>
-        </w:rPr>
-        <w:t xml:space="preserve">readable()</w:t>
-      </w:r>
-      <w:r>
-        <w:rPr>
-          <w:b w:val="false"/>
-          <w:bCs w:val="false"/>
-          <w:i w:val="false"/>
-          <w:iCs w:val="false"/>
-        </w:rPr>
-        <w:t xml:space="preserve">.</w:t>
-      </w:r>
-    </w:p>
-    <w:p>
-      <w:pPr>
-        <w:pStyle w:val="ListParagraph"/>
-        <w:numPr>
-          <w:ilvl w:val="0"/>
-          <w:numId w:val="3"/>
-        </w:numPr>
-        <w:spacing w:after="70" w:line="260"/>
-      </w:pPr>
-      <w:r>
-        <w:rPr>
-          <w:b/>
-          <w:bCs/>
-          <w:i w:val="false"/>
-          <w:iCs w:val="false"/>
-        </w:rPr>
-        <w:t xml:space="preserve">Scene resolution</w:t>
-      </w:r>
-      <w:r>
-        <w:rPr>
-          <w:b w:val="false"/>
-          <w:bCs w:val="false"/>
-          <w:i w:val="false"/>
-          <w:iCs w:val="false"/>
-        </w:rPr>
-        <w:t xml:space="preserve"> (§6.4a). 64×64 was sized for a synthetic star field; real spacecraft photographs would carry noticeably more detail at 96×96 or 128×128, at 2–4× the downlink cost.</w:t>
-      </w:r>
     </w:p>
     <w:p>
       <w:pPr>
@@ -22987,7 +23336,7 @@
           <w:sz w:val="19"/>
           <w:szCs w:val="19"/>
         </w:rPr>
-        <w:t xml:space="preserve">Version 0.7 — the firmware described here is built, boots under QEMU and passes an 81-check end-to-end suite. Remaining §15 items are content and tuning decisions, not blockers.</w:t>
+        <w:t xml:space="preserve">Version 1.0 — the firmware described here is built, boots under QEMU and macOS, and passes a 99-check end-to-end suite. §15 carries no open questions; what remains is the platform around the firmware, listed above.</w:t>
       </w:r>
     </w:p>
     <w:sectPr>

</xml_diff>